<commit_message>
aplication document update 2
</commit_message>
<xml_diff>
--- a/public/word-templates/applicationForCredits.docx
+++ b/public/word-templates/applicationForCredits.docx
@@ -2683,8 +2683,8 @@
         <w:tblLook w:val="04A0" w:firstRow="1" w:lastRow="0" w:firstColumn="1" w:lastColumn="0" w:noHBand="0" w:noVBand="1"/>
       </w:tblPr>
       <w:tblGrid>
-        <w:gridCol w:w="4518"/>
-        <w:gridCol w:w="4836"/>
+        <w:gridCol w:w="4519"/>
+        <w:gridCol w:w="4835"/>
       </w:tblGrid>
       <w:tr>
         <w:tc>
@@ -2808,7 +2808,7 @@
                 <w:sz w:val="24"/>
                 <w:szCs w:val="24"/>
               </w:rPr>
-              <w:t>Б. Сейдахметову</w:t>
+              <w:t>Нагайбаев А.Б</w:t>
             </w:r>
           </w:p>
         </w:tc>

</xml_diff>

<commit_message>
application update documents update
</commit_message>
<xml_diff>
--- a/public/word-templates/applicationForCredits.docx
+++ b/public/word-templates/applicationForCredits.docx
@@ -12,6 +12,9 @@
         <w:gridCol w:w="4707"/>
       </w:tblGrid>
       <w:tr>
+        <w:trPr>
+          <w:trHeight w:val="567"/>
+        </w:trPr>
         <w:tc>
           <w:tcPr>
             <w:tcW w:w="4785" w:type="dxa"/>
@@ -98,7 +101,17 @@
                 <w:szCs w:val="24"/>
                 <w:lang w:val="kk-KZ"/>
               </w:rPr>
-              <w:t>Нагайбаев А.Б.</w:t>
+              <w:t>Мамеков Д. А.</w:t>
+            </w:r>
+            <w:r>
+              <w:rPr>
+                <w:rFonts w:ascii="Times New Roman" w:hAnsi="Times New Roman"/>
+                <w:b/>
+                <w:sz w:val="24"/>
+                <w:szCs w:val="24"/>
+                <w:lang w:val="kk-KZ"/>
+              </w:rPr>
+              <w:t>.</w:t>
             </w:r>
           </w:p>
         </w:tc>
@@ -306,6 +319,7 @@
           <w:lang w:val="kk-KZ"/>
         </w:rPr>
       </w:pPr>
+      <w:proofErr w:type="spellStart"/>
       <w:r>
         <w:rPr>
           <w:rStyle w:val="ezkurwreuab5ozgtqnkl"/>
@@ -315,6 +329,7 @@
         </w:rPr>
         <w:t>облыс</w:t>
       </w:r>
+      <w:proofErr w:type="spellEnd"/>
       <w:r>
         <w:rPr>
           <w:rFonts w:ascii="Times New Roman" w:hAnsi="Times New Roman"/>
@@ -360,6 +375,7 @@
         </w:rPr>
         <w:t xml:space="preserve"> </w:t>
       </w:r>
+      <w:proofErr w:type="spellStart"/>
       <w:r>
         <w:rPr>
           <w:rStyle w:val="ezkurwreuab5ozgtqnkl"/>
@@ -369,6 +385,7 @@
         </w:rPr>
         <w:t>аудан</w:t>
       </w:r>
+      <w:proofErr w:type="spellEnd"/>
       <w:r>
         <w:rPr>
           <w:rStyle w:val="ezkurwreuab5ozgtqnkl"/>
@@ -392,6 +409,7 @@
           <w:szCs w:val="24"/>
         </w:rPr>
       </w:pPr>
+      <w:proofErr w:type="spellStart"/>
       <w:r>
         <w:rPr>
           <w:rStyle w:val="ezkurwreuab5ozgtqnkl"/>
@@ -401,6 +419,7 @@
         </w:rPr>
         <w:t>қала</w:t>
       </w:r>
+      <w:proofErr w:type="spellEnd"/>
       <w:r>
         <w:rPr>
           <w:rFonts w:ascii="Times New Roman" w:hAnsi="Times New Roman"/>
@@ -463,6 +482,7 @@
         </w:rPr>
         <w:t xml:space="preserve"> </w:t>
       </w:r>
+      <w:proofErr w:type="spellStart"/>
       <w:r>
         <w:rPr>
           <w:rStyle w:val="ezkurwreuab5ozgtqnkl"/>
@@ -472,6 +492,7 @@
         </w:rPr>
         <w:t>тіркеу</w:t>
       </w:r>
+      <w:proofErr w:type="spellEnd"/>
       <w:r>
         <w:rPr>
           <w:rFonts w:ascii="Times New Roman" w:hAnsi="Times New Roman"/>
@@ -480,6 +501,7 @@
         </w:rPr>
         <w:t xml:space="preserve"> </w:t>
       </w:r>
+      <w:proofErr w:type="spellStart"/>
       <w:r>
         <w:rPr>
           <w:rStyle w:val="ezkurwreuab5ozgtqnkl"/>
@@ -487,7 +509,17 @@
           <w:sz w:val="24"/>
           <w:szCs w:val="24"/>
         </w:rPr>
-        <w:t>мекенжайы_____________________</w:t>
+        <w:t>мекенжайы</w:t>
+      </w:r>
+      <w:proofErr w:type="spellEnd"/>
+      <w:r>
+        <w:rPr>
+          <w:rStyle w:val="ezkurwreuab5ozgtqnkl"/>
+          <w:rFonts w:ascii="Times New Roman" w:hAnsi="Times New Roman"/>
+          <w:sz w:val="24"/>
+          <w:szCs w:val="24"/>
+        </w:rPr>
+        <w:t>_____________________</w:t>
       </w:r>
       <w:r>
         <w:rPr>
@@ -1240,7 +1272,27 @@
                 <w:szCs w:val="24"/>
                 <w:lang w:val="en-US"/>
               </w:rPr>
-              <w:t>{base_kz}</w:t>
+              <w:t>{</w:t>
+            </w:r>
+            <w:proofErr w:type="spellStart"/>
+            <w:r>
+              <w:rPr>
+                <w:rFonts w:ascii="Times New Roman" w:hAnsi="Times New Roman"/>
+                <w:sz w:val="24"/>
+                <w:szCs w:val="24"/>
+                <w:lang w:val="en-US"/>
+              </w:rPr>
+              <w:t>base_kz</w:t>
+            </w:r>
+            <w:proofErr w:type="spellEnd"/>
+            <w:r>
+              <w:rPr>
+                <w:rFonts w:ascii="Times New Roman" w:hAnsi="Times New Roman"/>
+                <w:sz w:val="24"/>
+                <w:szCs w:val="24"/>
+                <w:lang w:val="en-US"/>
+              </w:rPr>
+              <w:t>}</w:t>
             </w:r>
           </w:p>
         </w:tc>
@@ -1517,7 +1569,27 @@
                 <w:szCs w:val="24"/>
                 <w:lang w:val="en-US"/>
               </w:rPr>
-              <w:t>{lang_edu}</w:t>
+              <w:t>{</w:t>
+            </w:r>
+            <w:proofErr w:type="spellStart"/>
+            <w:r>
+              <w:rPr>
+                <w:rFonts w:ascii="Times New Roman" w:hAnsi="Times New Roman"/>
+                <w:sz w:val="24"/>
+                <w:szCs w:val="24"/>
+                <w:lang w:val="en-US"/>
+              </w:rPr>
+              <w:t>lang_edu</w:t>
+            </w:r>
+            <w:proofErr w:type="spellEnd"/>
+            <w:r>
+              <w:rPr>
+                <w:rFonts w:ascii="Times New Roman" w:hAnsi="Times New Roman"/>
+                <w:sz w:val="24"/>
+                <w:szCs w:val="24"/>
+                <w:lang w:val="en-US"/>
+              </w:rPr>
+              <w:t>}</w:t>
             </w:r>
           </w:p>
         </w:tc>
@@ -1833,7 +1905,27 @@
                 <w:szCs w:val="24"/>
                 <w:lang w:val="en-US"/>
               </w:rPr>
-              <w:t>${gender_kz}</w:t>
+              <w:t>${</w:t>
+            </w:r>
+            <w:proofErr w:type="spellStart"/>
+            <w:r>
+              <w:rPr>
+                <w:rFonts w:ascii="Times New Roman" w:hAnsi="Times New Roman"/>
+                <w:sz w:val="24"/>
+                <w:szCs w:val="24"/>
+                <w:lang w:val="en-US"/>
+              </w:rPr>
+              <w:t>gender_kz</w:t>
+            </w:r>
+            <w:proofErr w:type="spellEnd"/>
+            <w:r>
+              <w:rPr>
+                <w:rFonts w:ascii="Times New Roman" w:hAnsi="Times New Roman"/>
+                <w:sz w:val="24"/>
+                <w:szCs w:val="24"/>
+                <w:lang w:val="en-US"/>
+              </w:rPr>
+              <w:t>}</w:t>
             </w:r>
           </w:p>
         </w:tc>
@@ -1922,7 +2014,27 @@
                 <w:szCs w:val="24"/>
                 <w:lang w:val="en-US"/>
               </w:rPr>
-              <w:t>{birth_date}</w:t>
+              <w:t>{</w:t>
+            </w:r>
+            <w:proofErr w:type="spellStart"/>
+            <w:r>
+              <w:rPr>
+                <w:rFonts w:ascii="Times New Roman" w:hAnsi="Times New Roman"/>
+                <w:sz w:val="24"/>
+                <w:szCs w:val="24"/>
+                <w:lang w:val="en-US"/>
+              </w:rPr>
+              <w:t>birth_date</w:t>
+            </w:r>
+            <w:proofErr w:type="spellEnd"/>
+            <w:r>
+              <w:rPr>
+                <w:rFonts w:ascii="Times New Roman" w:hAnsi="Times New Roman"/>
+                <w:sz w:val="24"/>
+                <w:szCs w:val="24"/>
+                <w:lang w:val="en-US"/>
+              </w:rPr>
+              <w:t>}</w:t>
             </w:r>
           </w:p>
         </w:tc>
@@ -2025,7 +2137,23 @@
                 <w:rFonts w:ascii="Times New Roman" w:hAnsi="Times New Roman"/>
                 <w:lang w:val="en-US"/>
               </w:rPr>
-              <w:t>${nationality_kz}</w:t>
+              <w:t>${</w:t>
+            </w:r>
+            <w:proofErr w:type="spellStart"/>
+            <w:r>
+              <w:rPr>
+                <w:rFonts w:ascii="Times New Roman" w:hAnsi="Times New Roman"/>
+                <w:lang w:val="en-US"/>
+              </w:rPr>
+              <w:t>nationality_kz</w:t>
+            </w:r>
+            <w:proofErr w:type="spellEnd"/>
+            <w:r>
+              <w:rPr>
+                <w:rFonts w:ascii="Times New Roman" w:hAnsi="Times New Roman"/>
+                <w:lang w:val="en-US"/>
+              </w:rPr>
+              <w:t>}</w:t>
             </w:r>
           </w:p>
         </w:tc>
@@ -2491,7 +2619,25 @@
                 <w:b/>
                 <w:lang w:val="en-US"/>
               </w:rPr>
-              <w:t>${cday}</w:t>
+              <w:t>${</w:t>
+            </w:r>
+            <w:proofErr w:type="spellStart"/>
+            <w:r>
+              <w:rPr>
+                <w:rFonts w:ascii="Times New Roman" w:hAnsi="Times New Roman"/>
+                <w:b/>
+                <w:lang w:val="en-US"/>
+              </w:rPr>
+              <w:t>cday</w:t>
+            </w:r>
+            <w:proofErr w:type="spellEnd"/>
+            <w:r>
+              <w:rPr>
+                <w:rFonts w:ascii="Times New Roman" w:hAnsi="Times New Roman"/>
+                <w:b/>
+                <w:lang w:val="en-US"/>
+              </w:rPr>
+              <w:t>}</w:t>
             </w:r>
             <w:r>
               <w:rPr>
@@ -2527,6 +2673,7 @@
               </w:rPr>
               <w:t>${</w:t>
             </w:r>
+            <w:proofErr w:type="spellStart"/>
             <w:r>
               <w:rPr>
                 <w:rFonts w:ascii="Times New Roman" w:hAnsi="Times New Roman"/>
@@ -2535,6 +2682,7 @@
               </w:rPr>
               <w:t>cd_month_kz</w:t>
             </w:r>
+            <w:proofErr w:type="spellEnd"/>
             <w:r>
               <w:rPr>
                 <w:rFonts w:ascii="Times New Roman" w:hAnsi="Times New Roman"/>
@@ -2571,7 +2719,25 @@
                 <w:b/>
                 <w:lang w:val="en-US"/>
               </w:rPr>
-              <w:t>${c_y}</w:t>
+              <w:t>${</w:t>
+            </w:r>
+            <w:proofErr w:type="spellStart"/>
+            <w:r>
+              <w:rPr>
+                <w:rFonts w:ascii="Times New Roman" w:hAnsi="Times New Roman"/>
+                <w:b/>
+                <w:lang w:val="en-US"/>
+              </w:rPr>
+              <w:t>c_y</w:t>
+            </w:r>
+            <w:proofErr w:type="spellEnd"/>
+            <w:r>
+              <w:rPr>
+                <w:rFonts w:ascii="Times New Roman" w:hAnsi="Times New Roman"/>
+                <w:b/>
+                <w:lang w:val="en-US"/>
+              </w:rPr>
+              <w:t>}</w:t>
             </w:r>
             <w:r>
               <w:rPr>
@@ -2801,6 +2967,7 @@
               </w:rPr>
               <w:t xml:space="preserve">виации </w:t>
             </w:r>
+            <w:proofErr w:type="spellStart"/>
             <w:r>
               <w:rPr>
                 <w:rFonts w:ascii="Times New Roman" w:hAnsi="Times New Roman"/>
@@ -2808,7 +2975,17 @@
                 <w:sz w:val="24"/>
                 <w:szCs w:val="24"/>
               </w:rPr>
-              <w:t>Нагайбаев А.Б</w:t>
+              <w:t>Мамеков</w:t>
+            </w:r>
+            <w:proofErr w:type="spellEnd"/>
+            <w:r>
+              <w:rPr>
+                <w:rFonts w:ascii="Times New Roman" w:hAnsi="Times New Roman"/>
+                <w:b/>
+                <w:sz w:val="24"/>
+                <w:szCs w:val="24"/>
+              </w:rPr>
+              <w:t xml:space="preserve"> Д. А.</w:t>
             </w:r>
           </w:p>
         </w:tc>
@@ -2897,6 +3074,7 @@
               </w:rPr>
               <w:t xml:space="preserve">От </w:t>
             </w:r>
+            <w:proofErr w:type="spellStart"/>
             <w:r>
               <w:rPr>
                 <w:rFonts w:ascii="Times New Roman" w:hAnsi="Times New Roman"/>
@@ -2906,6 +3084,7 @@
               </w:rPr>
               <w:t>гр</w:t>
             </w:r>
+            <w:proofErr w:type="spellEnd"/>
             <w:r>
               <w:rPr>
                 <w:rFonts w:ascii="Times New Roman" w:hAnsi="Times New Roman"/>
@@ -3853,7 +4032,27 @@
                 <w:szCs w:val="24"/>
                 <w:lang w:val="en-US"/>
               </w:rPr>
-              <w:t>{base_ru},</w:t>
+              <w:t>{</w:t>
+            </w:r>
+            <w:proofErr w:type="spellStart"/>
+            <w:r>
+              <w:rPr>
+                <w:rFonts w:ascii="Times New Roman" w:hAnsi="Times New Roman"/>
+                <w:sz w:val="24"/>
+                <w:szCs w:val="24"/>
+                <w:lang w:val="en-US"/>
+              </w:rPr>
+              <w:t>base_ru</w:t>
+            </w:r>
+            <w:proofErr w:type="spellEnd"/>
+            <w:r>
+              <w:rPr>
+                <w:rFonts w:ascii="Times New Roman" w:hAnsi="Times New Roman"/>
+                <w:sz w:val="24"/>
+                <w:szCs w:val="24"/>
+                <w:lang w:val="en-US"/>
+              </w:rPr>
+              <w:t>},</w:t>
             </w:r>
           </w:p>
         </w:tc>
@@ -3922,7 +4121,25 @@
           <w:sz w:val="14"/>
           <w:szCs w:val="24"/>
         </w:rPr>
-        <w:t xml:space="preserve">, ТиПО, </w:t>
+        <w:t xml:space="preserve">, </w:t>
+      </w:r>
+      <w:proofErr w:type="spellStart"/>
+      <w:r>
+        <w:rPr>
+          <w:rFonts w:ascii="Times New Roman" w:hAnsi="Times New Roman"/>
+          <w:sz w:val="14"/>
+          <w:szCs w:val="24"/>
+        </w:rPr>
+        <w:t>ТиПО</w:t>
+      </w:r>
+      <w:proofErr w:type="spellEnd"/>
+      <w:r>
+        <w:rPr>
+          <w:rFonts w:ascii="Times New Roman" w:hAnsi="Times New Roman"/>
+          <w:sz w:val="14"/>
+          <w:szCs w:val="24"/>
+        </w:rPr>
+        <w:t xml:space="preserve">, </w:t>
       </w:r>
       <w:r>
         <w:rPr>
@@ -4164,7 +4381,27 @@
                 <w:szCs w:val="24"/>
                 <w:lang w:val="en-US"/>
               </w:rPr>
-              <w:t>{lang_edu}</w:t>
+              <w:t>{</w:t>
+            </w:r>
+            <w:proofErr w:type="spellStart"/>
+            <w:r>
+              <w:rPr>
+                <w:rFonts w:ascii="Times New Roman" w:hAnsi="Times New Roman"/>
+                <w:sz w:val="24"/>
+                <w:szCs w:val="24"/>
+                <w:lang w:val="en-US"/>
+              </w:rPr>
+              <w:t>lang_edu</w:t>
+            </w:r>
+            <w:proofErr w:type="spellEnd"/>
+            <w:r>
+              <w:rPr>
+                <w:rFonts w:ascii="Times New Roman" w:hAnsi="Times New Roman"/>
+                <w:sz w:val="24"/>
+                <w:szCs w:val="24"/>
+                <w:lang w:val="en-US"/>
+              </w:rPr>
+              <w:t>}</w:t>
             </w:r>
           </w:p>
         </w:tc>
@@ -4449,7 +4686,27 @@
                 <w:szCs w:val="24"/>
                 <w:lang w:val="en-US"/>
               </w:rPr>
-              <w:t>${gender_ru}</w:t>
+              <w:t>${</w:t>
+            </w:r>
+            <w:proofErr w:type="spellStart"/>
+            <w:r>
+              <w:rPr>
+                <w:rFonts w:ascii="Times New Roman" w:hAnsi="Times New Roman"/>
+                <w:sz w:val="24"/>
+                <w:szCs w:val="24"/>
+                <w:lang w:val="en-US"/>
+              </w:rPr>
+              <w:t>gender_ru</w:t>
+            </w:r>
+            <w:proofErr w:type="spellEnd"/>
+            <w:r>
+              <w:rPr>
+                <w:rFonts w:ascii="Times New Roman" w:hAnsi="Times New Roman"/>
+                <w:sz w:val="24"/>
+                <w:szCs w:val="24"/>
+                <w:lang w:val="en-US"/>
+              </w:rPr>
+              <w:t>}</w:t>
             </w:r>
           </w:p>
         </w:tc>
@@ -4529,7 +4786,27 @@
                 <w:szCs w:val="24"/>
                 <w:lang w:val="en-US"/>
               </w:rPr>
-              <w:t>{birth_date}</w:t>
+              <w:t>{</w:t>
+            </w:r>
+            <w:proofErr w:type="spellStart"/>
+            <w:r>
+              <w:rPr>
+                <w:rFonts w:ascii="Times New Roman" w:hAnsi="Times New Roman"/>
+                <w:sz w:val="24"/>
+                <w:szCs w:val="24"/>
+                <w:lang w:val="en-US"/>
+              </w:rPr>
+              <w:t>birth_date</w:t>
+            </w:r>
+            <w:proofErr w:type="spellEnd"/>
+            <w:r>
+              <w:rPr>
+                <w:rFonts w:ascii="Times New Roman" w:hAnsi="Times New Roman"/>
+                <w:sz w:val="24"/>
+                <w:szCs w:val="24"/>
+                <w:lang w:val="en-US"/>
+              </w:rPr>
+              <w:t>}</w:t>
             </w:r>
           </w:p>
         </w:tc>
@@ -4633,7 +4910,23 @@
                 <w:rFonts w:ascii="Times New Roman" w:hAnsi="Times New Roman"/>
                 <w:lang w:val="en-US"/>
               </w:rPr>
-              <w:t>${nationality_ru}</w:t>
+              <w:t>${</w:t>
+            </w:r>
+            <w:proofErr w:type="spellStart"/>
+            <w:r>
+              <w:rPr>
+                <w:rFonts w:ascii="Times New Roman" w:hAnsi="Times New Roman"/>
+                <w:lang w:val="en-US"/>
+              </w:rPr>
+              <w:t>nationality_ru</w:t>
+            </w:r>
+            <w:proofErr w:type="spellEnd"/>
+            <w:r>
+              <w:rPr>
+                <w:rFonts w:ascii="Times New Roman" w:hAnsi="Times New Roman"/>
+                <w:lang w:val="en-US"/>
+              </w:rPr>
+              <w:t>}</w:t>
             </w:r>
           </w:p>
         </w:tc>
@@ -5159,7 +5452,25 @@
                 <w:b/>
                 <w:lang w:val="en-US"/>
               </w:rPr>
-              <w:t>${cday}</w:t>
+              <w:t>${</w:t>
+            </w:r>
+            <w:proofErr w:type="spellStart"/>
+            <w:r>
+              <w:rPr>
+                <w:rFonts w:ascii="Times New Roman" w:hAnsi="Times New Roman"/>
+                <w:b/>
+                <w:lang w:val="en-US"/>
+              </w:rPr>
+              <w:t>cday</w:t>
+            </w:r>
+            <w:proofErr w:type="spellEnd"/>
+            <w:r>
+              <w:rPr>
+                <w:rFonts w:ascii="Times New Roman" w:hAnsi="Times New Roman"/>
+                <w:b/>
+                <w:lang w:val="en-US"/>
+              </w:rPr>
+              <w:t>}</w:t>
             </w:r>
             <w:r>
               <w:rPr>
@@ -5195,6 +5506,7 @@
               </w:rPr>
               <w:t>${</w:t>
             </w:r>
+            <w:proofErr w:type="spellStart"/>
             <w:r>
               <w:rPr>
                 <w:rFonts w:ascii="Times New Roman" w:hAnsi="Times New Roman"/>
@@ -5203,6 +5515,7 @@
               </w:rPr>
               <w:t>cd_month_ru</w:t>
             </w:r>
+            <w:proofErr w:type="spellEnd"/>
             <w:r>
               <w:rPr>
                 <w:rFonts w:ascii="Times New Roman" w:hAnsi="Times New Roman"/>
@@ -5239,7 +5552,25 @@
                 <w:b/>
                 <w:lang w:val="en-US"/>
               </w:rPr>
-              <w:t>${c_y}</w:t>
+              <w:t>${</w:t>
+            </w:r>
+            <w:proofErr w:type="spellStart"/>
+            <w:r>
+              <w:rPr>
+                <w:rFonts w:ascii="Times New Roman" w:hAnsi="Times New Roman"/>
+                <w:b/>
+                <w:lang w:val="en-US"/>
+              </w:rPr>
+              <w:t>c_y</w:t>
+            </w:r>
+            <w:proofErr w:type="spellEnd"/>
+            <w:r>
+              <w:rPr>
+                <w:rFonts w:ascii="Times New Roman" w:hAnsi="Times New Roman"/>
+                <w:b/>
+                <w:lang w:val="en-US"/>
+              </w:rPr>
+              <w:t>}</w:t>
             </w:r>
             <w:r>
               <w:rPr>

</xml_diff>